<commit_message>
feat: add controller and view scaffolding
</commit_message>
<xml_diff>
--- a/docs/Source.docx
+++ b/docs/Source.docx
@@ -13,24 +13,60 @@
           <w:lang w:val="en-US"/>
         </w:rPr>
       </w:pPr>
-      <w:r>
-        <w:rPr>
-          <w:lang w:val="en-US"/>
-        </w:rPr>
-        <w:t>Promt diseign Figma</w:t>
-      </w:r>
-    </w:p>
-    <w:p>
-      <w:pPr>
-        <w:rPr>
-          <w:lang w:val="en-US"/>
-        </w:rPr>
-      </w:pPr>
-      <w:r>
-        <w:rPr>
-          <w:lang w:val="en-US"/>
-        </w:rPr>
-        <w:t>Create a professional desktop homepage mockup (1440px wide) for the fictional German company "Ziegen-Schafe-Kuh GmbH &amp; Co. KG" and its web application "ZSK-Rechner".</w:t>
+      <w:proofErr w:type="spellStart"/>
+      <w:r>
+        <w:rPr>
+          <w:lang w:val="en-US"/>
+        </w:rPr>
+        <w:t>Promt</w:t>
+      </w:r>
+      <w:proofErr w:type="spellEnd"/>
+      <w:r>
+        <w:rPr>
+          <w:lang w:val="en-US"/>
+        </w:rPr>
+        <w:t xml:space="preserve">- </w:t>
+      </w:r>
+      <w:proofErr w:type="spellStart"/>
+      <w:r>
+        <w:rPr>
+          <w:lang w:val="en-US"/>
+        </w:rPr>
+        <w:t>disign</w:t>
+      </w:r>
+      <w:proofErr w:type="spellEnd"/>
+      <w:r>
+        <w:rPr>
+          <w:lang w:val="en-US"/>
+        </w:rPr>
+        <w:t xml:space="preserve"> Figma</w:t>
+      </w:r>
+    </w:p>
+    <w:p>
+      <w:pPr>
+        <w:rPr>
+          <w:lang w:val="en-US"/>
+        </w:rPr>
+      </w:pPr>
+      <w:r>
+        <w:rPr>
+          <w:lang w:val="en-US"/>
+        </w:rPr>
+        <w:t>Create a professional desktop homepage for the fictional German company "Ziegen-</w:t>
+      </w:r>
+      <w:proofErr w:type="spellStart"/>
+      <w:r>
+        <w:rPr>
+          <w:lang w:val="en-US"/>
+        </w:rPr>
+        <w:t>Schafe</w:t>
+      </w:r>
+      <w:proofErr w:type="spellEnd"/>
+      <w:r>
+        <w:rPr>
+          <w:lang w:val="en-US"/>
+        </w:rPr>
+        <w:t>-Kuh GmbH &amp; Co. KG" and its web application "ZSK-Rechner".</w:t>
       </w:r>
     </w:p>
     <w:p>
@@ -117,7 +153,35 @@
         <w:rPr>
           <w:lang w:val="en-US"/>
         </w:rPr>
-        <w:t>- Header with company logo and navigation: Startseite, Rechner, Tierverwaltung.</w:t>
+        <w:t xml:space="preserve">- Header with company logo and navigation: </w:t>
+      </w:r>
+      <w:proofErr w:type="spellStart"/>
+      <w:r>
+        <w:rPr>
+          <w:lang w:val="en-US"/>
+        </w:rPr>
+        <w:t>Startseite</w:t>
+      </w:r>
+      <w:proofErr w:type="spellEnd"/>
+      <w:r>
+        <w:rPr>
+          <w:lang w:val="en-US"/>
+        </w:rPr>
+        <w:t xml:space="preserve">, Rechner, </w:t>
+      </w:r>
+      <w:proofErr w:type="spellStart"/>
+      <w:r>
+        <w:rPr>
+          <w:lang w:val="en-US"/>
+        </w:rPr>
+        <w:t>Tierverwaltung</w:t>
+      </w:r>
+      <w:proofErr w:type="spellEnd"/>
+      <w:r>
+        <w:rPr>
+          <w:lang w:val="en-US"/>
+        </w:rPr>
+        <w:t>.</w:t>
       </w:r>
     </w:p>
     <w:p>

</xml_diff>